<commit_message>
Anten/RTK ve Magn Testleri eklendi
</commit_message>
<xml_diff>
--- a/UserGuide.docx
+++ b/UserGuide.docx
@@ -9,6 +9,7 @@
         <w:keepLines w:val="0"/>
         <w:widowControl/>
         <w:suppressLineNumbers w:val="0"/>
+        <w:jc w:val="center"/>
         <w:rPr>
           <w:rFonts w:hint="default" w:ascii="Arial" w:hAnsi="Arial" w:cs="Arial"/>
           <w:sz w:val="24"/>
@@ -39,6 +40,40 @@
           <w:szCs w:val="24"/>
         </w:rPr>
         <w:t xml:space="preserve"> Kontrol GUI Kullanım Kılavuzu</w:t>
+      </w:r>
+    </w:p>
+    <w:p>
+      <w:pPr>
+        <w:rPr>
+          <w:rFonts w:hint="default"/>
+        </w:rPr>
+      </w:pPr>
+    </w:p>
+    <w:p>
+      <w:pPr>
+        <w:numPr>
+          <w:ilvl w:val="0"/>
+          <w:numId w:val="1"/>
+        </w:numPr>
+        <w:ind w:left="425" w:leftChars="0" w:hanging="425" w:firstLineChars="0"/>
+        <w:rPr>
+          <w:rFonts w:hint="default"/>
+          <w:b/>
+          <w:bCs/>
+          <w:sz w:val="24"/>
+          <w:szCs w:val="24"/>
+        </w:rPr>
+      </w:pPr>
+      <w:r>
+        <w:rPr>
+          <w:rFonts w:hint="default" w:ascii="Arial" w:hAnsi="Arial" w:cs="Arial"/>
+          <w:b/>
+          <w:bCs/>
+          <w:sz w:val="24"/>
+          <w:szCs w:val="24"/>
+          <w:lang w:val="tr-TR"/>
+        </w:rPr>
+        <w:t>Kalibrasyon Sonrası Testleri</w:t>
       </w:r>
     </w:p>
     <w:p>
@@ -87,7 +122,7 @@
         <w:widowControl/>
         <w:numPr>
           <w:ilvl w:val="0"/>
-          <w:numId w:val="1"/>
+          <w:numId w:val="2"/>
         </w:numPr>
         <w:suppressLineNumbers w:val="0"/>
         <w:spacing w:before="0" w:beforeAutospacing="1" w:after="0" w:afterAutospacing="1"/>
@@ -172,7 +207,7 @@
         <w:widowControl/>
         <w:numPr>
           <w:ilvl w:val="0"/>
-          <w:numId w:val="1"/>
+          <w:numId w:val="2"/>
         </w:numPr>
         <w:suppressLineNumbers w:val="0"/>
         <w:spacing w:before="0" w:beforeAutospacing="1" w:after="0" w:afterAutospacing="1"/>
@@ -228,18 +263,7 @@
           <w:szCs w:val="24"/>
           <w:lang w:val="tr-TR"/>
         </w:rPr>
-        <w:t>Ş</w:t>
-      </w:r>
-      <w:r>
-        <w:rPr>
-          <w:rFonts w:hint="default" w:ascii="Arial" w:hAnsi="Arial" w:cs="Arial"/>
-          <w:b/>
-          <w:bCs/>
-          <w:sz w:val="24"/>
-          <w:szCs w:val="24"/>
-          <w:lang w:val="tr-TR"/>
-        </w:rPr>
-        <w:t>ekil</w:t>
+        <w:t>Şekil</w:t>
       </w:r>
       <w:r>
         <w:rPr>
@@ -276,6 +300,7 @@
         <w:keepLines w:val="0"/>
         <w:widowControl/>
         <w:numPr>
+          <w:ilvl w:val="0"/>
           <w:numId w:val="0"/>
         </w:numPr>
         <w:suppressLineNumbers w:val="0"/>
@@ -349,6 +374,7 @@
         <w:keepLines w:val="0"/>
         <w:widowControl/>
         <w:numPr>
+          <w:ilvl w:val="0"/>
           <w:numId w:val="0"/>
         </w:numPr>
         <w:suppressLineNumbers w:val="0"/>
@@ -376,18 +402,7 @@
           <w:szCs w:val="24"/>
           <w:lang w:val="tr-TR"/>
         </w:rPr>
-        <w:t>Ş</w:t>
-      </w:r>
-      <w:r>
-        <w:rPr>
-          <w:rFonts w:hint="default" w:ascii="Arial" w:hAnsi="Arial" w:cs="Arial"/>
-          <w:b/>
-          <w:bCs/>
-          <w:sz w:val="24"/>
-          <w:szCs w:val="24"/>
-          <w:lang w:val="tr-TR"/>
-        </w:rPr>
-        <w:t>ekil</w:t>
+        <w:t>Şekil</w:t>
       </w:r>
       <w:r>
         <w:rPr>
@@ -458,29 +473,7 @@
           <w:szCs w:val="24"/>
           <w:lang w:val="tr-TR"/>
         </w:rPr>
-        <w:t xml:space="preserve">: M2GR Sistemi için, Röle Entegre Edilmiş </w:t>
-      </w:r>
-      <w:r>
-        <w:rPr>
-          <w:rFonts w:hint="default" w:ascii="Arial" w:hAnsi="Arial" w:cs="Arial"/>
-          <w:b/>
-          <w:bCs/>
-          <w:sz w:val="24"/>
-          <w:szCs w:val="24"/>
-          <w:lang w:val="tr-TR"/>
-        </w:rPr>
-        <w:t>AR-M-F1024-U-A</w:t>
-      </w:r>
-      <w:r>
-        <w:rPr>
-          <w:rFonts w:hint="default" w:ascii="Arial" w:hAnsi="Arial" w:cs="Arial"/>
-          <w:b/>
-          <w:bCs/>
-          <w:sz w:val="24"/>
-          <w:szCs w:val="24"/>
-          <w:lang w:val="tr-TR"/>
-        </w:rPr>
-        <w:t xml:space="preserve"> Kablosu</w:t>
+        <w:t>: M2GR Sistemi için, Röle Entegre Edilmiş AR-M-F1024-U-A Kablosu</w:t>
       </w:r>
       <w:bookmarkEnd w:id="0"/>
     </w:p>
@@ -491,7 +484,7 @@
         <w:widowControl/>
         <w:numPr>
           <w:ilvl w:val="0"/>
-          <w:numId w:val="1"/>
+          <w:numId w:val="2"/>
         </w:numPr>
         <w:suppressLineNumbers w:val="0"/>
         <w:spacing w:before="0" w:beforeAutospacing="1" w:after="0" w:afterAutospacing="1"/>
@@ -547,18 +540,7 @@
           <w:szCs w:val="24"/>
           <w:lang w:val="tr-TR"/>
         </w:rPr>
-        <w:t>Ş</w:t>
-      </w:r>
-      <w:r>
-        <w:rPr>
-          <w:rFonts w:hint="default" w:ascii="Arial" w:hAnsi="Arial" w:cs="Arial"/>
-          <w:b/>
-          <w:bCs/>
-          <w:sz w:val="24"/>
-          <w:szCs w:val="24"/>
-          <w:lang w:val="tr-TR"/>
-        </w:rPr>
-        <w:t>ekil</w:t>
+        <w:t>Şekil</w:t>
       </w:r>
       <w:r>
         <w:rPr>
@@ -595,6 +577,7 @@
         <w:keepLines w:val="0"/>
         <w:widowControl/>
         <w:numPr>
+          <w:ilvl w:val="0"/>
           <w:numId w:val="0"/>
         </w:numPr>
         <w:suppressLineNumbers w:val="0"/>
@@ -666,6 +649,7 @@
         <w:keepLines w:val="0"/>
         <w:widowControl/>
         <w:numPr>
+          <w:ilvl w:val="0"/>
           <w:numId w:val="0"/>
         </w:numPr>
         <w:suppressLineNumbers w:val="0"/>
@@ -693,18 +677,7 @@
           <w:szCs w:val="24"/>
           <w:lang w:val="tr-TR"/>
         </w:rPr>
-        <w:t>Ş</w:t>
-      </w:r>
-      <w:r>
-        <w:rPr>
-          <w:rFonts w:hint="default" w:ascii="Arial" w:hAnsi="Arial" w:cs="Arial"/>
-          <w:b/>
-          <w:bCs/>
-          <w:sz w:val="24"/>
-          <w:szCs w:val="24"/>
-          <w:lang w:val="tr-TR"/>
-        </w:rPr>
-        <w:t>ekil</w:t>
+        <w:t>Şekil</w:t>
       </w:r>
       <w:r>
         <w:rPr>
@@ -778,195 +751,6 @@
         <w:t>: S3A Sistemi için, Röle Entegre Edilmiş AR-S3-H-102-UA-DK Kablosu</w:t>
       </w:r>
       <w:bookmarkEnd w:id="1"/>
-    </w:p>
-    <w:p>
-      <w:pPr>
-        <w:keepNext w:val="0"/>
-        <w:keepLines w:val="0"/>
-        <w:widowControl/>
-        <w:numPr>
-          <w:ilvl w:val="0"/>
-          <w:numId w:val="1"/>
-        </w:numPr>
-        <w:suppressLineNumbers w:val="0"/>
-        <w:spacing w:before="0" w:beforeAutospacing="1" w:after="0" w:afterAutospacing="1"/>
-        <w:ind w:left="720" w:hanging="360"/>
-        <w:rPr>
-          <w:rFonts w:hint="default" w:ascii="Arial" w:hAnsi="Arial" w:cs="Arial"/>
-          <w:sz w:val="24"/>
-          <w:szCs w:val="24"/>
-        </w:rPr>
-      </w:pPr>
-      <w:r>
-        <w:rPr>
-          <w:rFonts w:hint="default" w:ascii="Arial" w:hAnsi="Arial" w:cs="Arial"/>
-          <w:sz w:val="24"/>
-          <w:szCs w:val="24"/>
-        </w:rPr>
-        <w:t>ArView programı açıksa kapatın.</w:t>
-      </w:r>
-    </w:p>
-    <w:p>
-      <w:pPr>
-        <w:keepNext w:val="0"/>
-        <w:keepLines w:val="0"/>
-        <w:widowControl/>
-        <w:numPr>
-          <w:ilvl w:val="0"/>
-          <w:numId w:val="1"/>
-        </w:numPr>
-        <w:suppressLineNumbers w:val="0"/>
-        <w:spacing w:before="0" w:beforeAutospacing="1" w:after="0" w:afterAutospacing="1"/>
-        <w:ind w:left="720" w:hanging="360"/>
-        <w:rPr>
-          <w:rFonts w:hint="default" w:ascii="Arial" w:hAnsi="Arial" w:cs="Arial"/>
-          <w:sz w:val="24"/>
-          <w:szCs w:val="24"/>
-        </w:rPr>
-      </w:pPr>
-      <w:r>
-        <w:rPr>
-          <w:rFonts w:hint="default" w:ascii="Arial" w:hAnsi="Arial" w:cs="Arial"/>
-          <w:sz w:val="24"/>
-          <w:szCs w:val="24"/>
-          <w:lang w:val="tr-TR"/>
-        </w:rPr>
-        <w:t xml:space="preserve">ArView ekranı ile GUI ekranı üst üste açılmamalıdır. Bu nedenle çift ekran kullanımı önerilmektedir. Tek ekranlı bilgisayarlarda ise iki pencerenin yan yana yerleştirilmesi ve ArView’daki </w:t>
-      </w:r>
-      <w:r>
-        <w:rPr>
-          <w:rFonts w:hint="default" w:ascii="Arial" w:hAnsi="Arial" w:cs="Arial"/>
-          <w:b/>
-          <w:bCs/>
-          <w:sz w:val="24"/>
-          <w:szCs w:val="24"/>
-          <w:lang w:val="tr-TR"/>
-        </w:rPr>
-        <w:t>“Connect”</w:t>
-      </w:r>
-      <w:r>
-        <w:rPr>
-          <w:rFonts w:hint="default" w:ascii="Arial" w:hAnsi="Arial" w:cs="Arial"/>
-          <w:sz w:val="24"/>
-          <w:szCs w:val="24"/>
-          <w:lang w:val="tr-TR"/>
-        </w:rPr>
-        <w:t xml:space="preserve"> tuşu ile GUI ekranındaki </w:t>
-      </w:r>
-      <w:r>
-        <w:rPr>
-          <w:rFonts w:hint="default" w:ascii="Arial" w:hAnsi="Arial" w:cs="Arial"/>
-          <w:b/>
-          <w:bCs/>
-          <w:sz w:val="24"/>
-          <w:szCs w:val="24"/>
-          <w:lang w:val="tr-TR"/>
-        </w:rPr>
-        <w:t>“Yapılacaklar”</w:t>
-      </w:r>
-      <w:r>
-        <w:rPr>
-          <w:rFonts w:hint="default" w:ascii="Arial" w:hAnsi="Arial" w:cs="Arial"/>
-          <w:sz w:val="24"/>
-          <w:szCs w:val="24"/>
-          <w:lang w:val="tr-TR"/>
-        </w:rPr>
-        <w:t xml:space="preserve"> kutusunun aynı anda görünür olması sağlanmalıdır. Bu koşullar sağlanmazsa test yapılamaz. </w:t>
-      </w:r>
-    </w:p>
-    <w:p>
-      <w:pPr>
-        <w:keepNext w:val="0"/>
-        <w:keepLines w:val="0"/>
-        <w:widowControl/>
-        <w:numPr>
-          <w:ilvl w:val="0"/>
-          <w:numId w:val="1"/>
-        </w:numPr>
-        <w:suppressLineNumbers w:val="0"/>
-        <w:spacing w:before="0" w:beforeAutospacing="1" w:after="0" w:afterAutospacing="1"/>
-        <w:ind w:left="720" w:hanging="360"/>
-        <w:rPr>
-          <w:rFonts w:hint="default" w:ascii="Arial" w:hAnsi="Arial" w:cs="Arial"/>
-          <w:sz w:val="24"/>
-          <w:szCs w:val="24"/>
-        </w:rPr>
-      </w:pPr>
-      <w:r>
-        <w:rPr>
-          <w:rFonts w:hint="default" w:ascii="Arial" w:hAnsi="Arial" w:cs="Arial"/>
-          <w:sz w:val="24"/>
-          <w:szCs w:val="24"/>
-        </w:rPr>
-        <w:t>Test boyunca cihazın kablosunu çıkarmayın.</w:t>
-      </w:r>
-    </w:p>
-    <w:p>
-      <w:pPr>
-        <w:keepNext w:val="0"/>
-        <w:keepLines w:val="0"/>
-        <w:widowControl/>
-        <w:numPr>
-          <w:ilvl w:val="0"/>
-          <w:numId w:val="1"/>
-        </w:numPr>
-        <w:suppressLineNumbers w:val="0"/>
-        <w:spacing w:before="0" w:beforeAutospacing="1" w:after="0" w:afterAutospacing="1"/>
-        <w:ind w:left="720" w:hanging="360"/>
-        <w:rPr>
-          <w:rFonts w:hint="default" w:ascii="Arial" w:hAnsi="Arial" w:cs="Arial"/>
-          <w:sz w:val="24"/>
-          <w:szCs w:val="24"/>
-        </w:rPr>
-      </w:pPr>
-      <w:r>
-        <w:rPr>
-          <w:rFonts w:hint="default" w:ascii="Arial" w:hAnsi="Arial" w:cs="Arial"/>
-          <w:sz w:val="24"/>
-          <w:szCs w:val="24"/>
-          <w:lang w:val="tr-TR"/>
-        </w:rPr>
-        <w:t>Test yapılacak sistemi uygun kablosu ile bağlayın. Röle, USB çoklayıcı üzerinden bilgisayara bağlanmalıdır. ArNav kartı ise doğrudan USB ile bilgisayara bağlanmalıdır.</w:t>
-      </w:r>
-    </w:p>
-    <w:p>
-      <w:pPr>
-        <w:pStyle w:val="3"/>
-        <w:keepNext w:val="0"/>
-        <w:keepLines w:val="0"/>
-        <w:widowControl/>
-        <w:suppressLineNumbers w:val="0"/>
-        <w:rPr>
-          <w:rFonts w:hint="default" w:ascii="Arial" w:hAnsi="Arial" w:cs="Arial"/>
-          <w:sz w:val="24"/>
-          <w:szCs w:val="24"/>
-        </w:rPr>
-      </w:pPr>
-      <w:r>
-        <w:rPr>
-          <w:rFonts w:hint="default" w:ascii="Arial" w:hAnsi="Arial" w:cs="Arial"/>
-          <w:sz w:val="24"/>
-          <w:szCs w:val="24"/>
-        </w:rPr>
-        <w:t xml:space="preserve">Programı </w:t>
-      </w:r>
-      <w:r>
-        <w:rPr>
-          <w:rFonts w:hint="default" w:ascii="Arial" w:hAnsi="Arial" w:cs="Arial"/>
-          <w:sz w:val="24"/>
-          <w:szCs w:val="24"/>
-          <w:lang w:val="tr-TR"/>
-        </w:rPr>
-        <w:t>A</w:t>
-      </w:r>
-      <w:r>
-        <w:rPr>
-          <w:rFonts w:hint="default" w:ascii="Arial" w:hAnsi="Arial" w:cs="Arial"/>
-          <w:sz w:val="24"/>
-          <w:szCs w:val="24"/>
-        </w:rPr>
-        <w:t>çma</w:t>
-      </w:r>
     </w:p>
     <w:p>
       <w:pPr>
@@ -988,20 +772,11 @@
       </w:pPr>
       <w:r>
         <w:rPr>
-          <w:rStyle w:val="8"/>
-          <w:rFonts w:hint="default" w:ascii="Arial" w:hAnsi="Arial" w:cs="Arial"/>
-          <w:sz w:val="24"/>
-          <w:szCs w:val="24"/>
-        </w:rPr>
-        <w:t>Start Kalib GUI.bat</w:t>
-      </w:r>
-      <w:r>
-        <w:rPr>
-          <w:rFonts w:hint="default" w:ascii="Arial" w:hAnsi="Arial" w:cs="Arial"/>
-          <w:sz w:val="24"/>
-          <w:szCs w:val="24"/>
-        </w:rPr>
-        <w:t xml:space="preserve"> dosyasına çift tıklayın.</w:t>
+          <w:rFonts w:hint="default" w:ascii="Arial" w:hAnsi="Arial" w:cs="Arial"/>
+          <w:sz w:val="24"/>
+          <w:szCs w:val="24"/>
+        </w:rPr>
+        <w:t>ArView programı açıksa kapatın.</w:t>
       </w:r>
     </w:p>
     <w:p>
@@ -1027,25 +802,49 @@
           <w:rFonts w:hint="default" w:ascii="Arial" w:hAnsi="Arial" w:cs="Arial"/>
           <w:sz w:val="24"/>
           <w:szCs w:val="24"/>
-        </w:rPr>
-        <w:t xml:space="preserve">Bilgisayar izin isterse </w:t>
-      </w:r>
-      <w:r>
-        <w:rPr>
-          <w:rStyle w:val="8"/>
-          <w:rFonts w:hint="default" w:ascii="Arial" w:hAnsi="Arial" w:cs="Arial"/>
-          <w:sz w:val="24"/>
-          <w:szCs w:val="24"/>
-        </w:rPr>
-        <w:t>Evet</w:t>
-      </w:r>
-      <w:r>
-        <w:rPr>
-          <w:rFonts w:hint="default" w:ascii="Arial" w:hAnsi="Arial" w:cs="Arial"/>
-          <w:sz w:val="24"/>
-          <w:szCs w:val="24"/>
-        </w:rPr>
-        <w:t>’e tıklayın.</w:t>
+          <w:lang w:val="tr-TR"/>
+        </w:rPr>
+        <w:t xml:space="preserve">ArView ekranı ile GUI ekranı üst üste açılmamalıdır. Bu nedenle çift ekran kullanımı önerilmektedir. Tek ekranlı bilgisayarlarda ise iki pencerenin yan yana yerleştirilmesi ve ArView’daki </w:t>
+      </w:r>
+      <w:r>
+        <w:rPr>
+          <w:rFonts w:hint="default" w:ascii="Arial" w:hAnsi="Arial" w:cs="Arial"/>
+          <w:b/>
+          <w:bCs/>
+          <w:sz w:val="24"/>
+          <w:szCs w:val="24"/>
+          <w:lang w:val="tr-TR"/>
+        </w:rPr>
+        <w:t>“Connect”</w:t>
+      </w:r>
+      <w:r>
+        <w:rPr>
+          <w:rFonts w:hint="default" w:ascii="Arial" w:hAnsi="Arial" w:cs="Arial"/>
+          <w:sz w:val="24"/>
+          <w:szCs w:val="24"/>
+          <w:lang w:val="tr-TR"/>
+        </w:rPr>
+        <w:t xml:space="preserve"> tuşu ile GUI ekranındaki </w:t>
+      </w:r>
+      <w:r>
+        <w:rPr>
+          <w:rFonts w:hint="default" w:ascii="Arial" w:hAnsi="Arial" w:cs="Arial"/>
+          <w:b/>
+          <w:bCs/>
+          <w:sz w:val="24"/>
+          <w:szCs w:val="24"/>
+          <w:lang w:val="tr-TR"/>
+        </w:rPr>
+        <w:t>“Yapılacaklar”</w:t>
+      </w:r>
+      <w:r>
+        <w:rPr>
+          <w:rFonts w:hint="default" w:ascii="Arial" w:hAnsi="Arial" w:cs="Arial"/>
+          <w:sz w:val="24"/>
+          <w:szCs w:val="24"/>
+          <w:lang w:val="tr-TR"/>
+        </w:rPr>
+        <w:t xml:space="preserve"> kutusunun aynı anda görünür olması sağlanmalıdır. Bu koşullar sağlanmazsa test yapılamaz. </w:t>
       </w:r>
     </w:p>
     <w:p>
@@ -1072,7 +871,35 @@
           <w:sz w:val="24"/>
           <w:szCs w:val="24"/>
         </w:rPr>
-        <w:t>Kontrol ekranı tarayıcıda açılır. Program zaten açıksa dosyaya tekrar çift tıklamayın.</w:t>
+        <w:t>Test boyunca cihazın kablosunu çıkarmayın.</w:t>
+      </w:r>
+    </w:p>
+    <w:p>
+      <w:pPr>
+        <w:keepNext w:val="0"/>
+        <w:keepLines w:val="0"/>
+        <w:widowControl/>
+        <w:numPr>
+          <w:ilvl w:val="0"/>
+          <w:numId w:val="2"/>
+        </w:numPr>
+        <w:suppressLineNumbers w:val="0"/>
+        <w:spacing w:before="0" w:beforeAutospacing="1" w:after="0" w:afterAutospacing="1"/>
+        <w:ind w:left="720" w:hanging="360"/>
+        <w:rPr>
+          <w:rFonts w:hint="default" w:ascii="Arial" w:hAnsi="Arial" w:cs="Arial"/>
+          <w:sz w:val="24"/>
+          <w:szCs w:val="24"/>
+        </w:rPr>
+      </w:pPr>
+      <w:r>
+        <w:rPr>
+          <w:rFonts w:hint="default" w:ascii="Arial" w:hAnsi="Arial" w:cs="Arial"/>
+          <w:sz w:val="24"/>
+          <w:szCs w:val="24"/>
+          <w:lang w:val="tr-TR"/>
+        </w:rPr>
+        <w:t>Test yapılacak sistemi uygun kablosu ile bağlayın. Röle, USB çoklayıcı üzerinden bilgisayara bağlanmalıdır. ArNav kartı ise doğrudan USB ile bilgisayara bağlanmalıdır.</w:t>
       </w:r>
     </w:p>
     <w:p>
@@ -1094,24 +921,24 @@
           <w:sz w:val="24"/>
           <w:szCs w:val="24"/>
         </w:rPr>
-        <w:t xml:space="preserve">Testi </w:t>
-      </w:r>
-      <w:r>
-        <w:rPr>
-          <w:rFonts w:hint="default" w:ascii="Arial" w:hAnsi="Arial" w:cs="Arial"/>
-          <w:sz w:val="24"/>
-          <w:szCs w:val="24"/>
-          <w:lang w:val="tr-TR"/>
-        </w:rPr>
-        <w:t>B</w:t>
-      </w:r>
-      <w:r>
-        <w:rPr>
-          <w:rFonts w:hint="default" w:ascii="Arial" w:hAnsi="Arial" w:cs="Arial"/>
-          <w:sz w:val="24"/>
-          <w:szCs w:val="24"/>
-        </w:rPr>
-        <w:t>aşlatma</w:t>
+        <w:t xml:space="preserve">Programı </w:t>
+      </w:r>
+      <w:r>
+        <w:rPr>
+          <w:rFonts w:hint="default" w:ascii="Arial" w:hAnsi="Arial" w:cs="Arial"/>
+          <w:sz w:val="24"/>
+          <w:szCs w:val="24"/>
+          <w:lang w:val="tr-TR"/>
+        </w:rPr>
+        <w:t>A</w:t>
+      </w:r>
+      <w:r>
+        <w:rPr>
+          <w:rFonts w:hint="default" w:ascii="Arial" w:hAnsi="Arial" w:cs="Arial"/>
+          <w:sz w:val="24"/>
+          <w:szCs w:val="24"/>
+        </w:rPr>
+        <w:t>çma</w:t>
       </w:r>
     </w:p>
     <w:p>
@@ -1134,12 +961,20 @@
       </w:pPr>
       <w:r>
         <w:rPr>
-          <w:rFonts w:hint="default" w:ascii="Arial" w:hAnsi="Arial" w:cs="Arial"/>
-          <w:sz w:val="24"/>
-          <w:szCs w:val="24"/>
-          <w:lang w:val="tr-TR"/>
-        </w:rPr>
-        <w:t>Sistemi masa üstünde düz duracak şekilde konumlandırın.</w:t>
+          <w:rStyle w:val="8"/>
+          <w:rFonts w:hint="default" w:ascii="Arial" w:hAnsi="Arial" w:cs="Arial"/>
+          <w:sz w:val="24"/>
+          <w:szCs w:val="24"/>
+        </w:rPr>
+        <w:t>Start Kalib GUI.bat</w:t>
+      </w:r>
+      <w:r>
+        <w:rPr>
+          <w:rFonts w:hint="default" w:ascii="Arial" w:hAnsi="Arial" w:cs="Arial"/>
+          <w:sz w:val="24"/>
+          <w:szCs w:val="24"/>
+        </w:rPr>
+        <w:t xml:space="preserve"> dosyasına çift tıklayın.</w:t>
       </w:r>
     </w:p>
     <w:p>
@@ -1162,25 +997,60 @@
       </w:pPr>
       <w:r>
         <w:rPr>
+          <w:rFonts w:hint="default" w:ascii="Arial" w:hAnsi="Arial" w:cs="Arial"/>
+          <w:sz w:val="24"/>
+          <w:szCs w:val="24"/>
+        </w:rPr>
+        <w:t xml:space="preserve">Bilgisayar izin isterse </w:t>
+      </w:r>
+      <w:r>
+        <w:rPr>
           <w:rStyle w:val="8"/>
           <w:rFonts w:hint="default" w:ascii="Arial" w:hAnsi="Arial" w:cs="Arial"/>
           <w:sz w:val="24"/>
           <w:szCs w:val="24"/>
         </w:rPr>
-        <w:t>Başlat</w:t>
-      </w:r>
-      <w:r>
-        <w:rPr>
-          <w:rFonts w:hint="default" w:ascii="Arial" w:hAnsi="Arial" w:cs="Arial"/>
-          <w:sz w:val="24"/>
-          <w:szCs w:val="24"/>
-        </w:rPr>
-        <w:t xml:space="preserve"> düğmesine basın.</w:t>
-      </w:r>
-    </w:p>
-    <w:p>
-      <w:pPr>
-        <w:pStyle w:val="7"/>
+        <w:t>Evet</w:t>
+      </w:r>
+      <w:r>
+        <w:rPr>
+          <w:rFonts w:hint="default" w:ascii="Arial" w:hAnsi="Arial" w:cs="Arial"/>
+          <w:sz w:val="24"/>
+          <w:szCs w:val="24"/>
+        </w:rPr>
+        <w:t>’e tıklayın.</w:t>
+      </w:r>
+    </w:p>
+    <w:p>
+      <w:pPr>
+        <w:keepNext w:val="0"/>
+        <w:keepLines w:val="0"/>
+        <w:widowControl/>
+        <w:numPr>
+          <w:ilvl w:val="0"/>
+          <w:numId w:val="3"/>
+        </w:numPr>
+        <w:suppressLineNumbers w:val="0"/>
+        <w:spacing w:before="0" w:beforeAutospacing="1" w:after="0" w:afterAutospacing="1"/>
+        <w:ind w:left="720" w:hanging="360"/>
+        <w:rPr>
+          <w:rFonts w:hint="default" w:ascii="Arial" w:hAnsi="Arial" w:cs="Arial"/>
+          <w:sz w:val="24"/>
+          <w:szCs w:val="24"/>
+        </w:rPr>
+      </w:pPr>
+      <w:r>
+        <w:rPr>
+          <w:rFonts w:hint="default" w:ascii="Arial" w:hAnsi="Arial" w:cs="Arial"/>
+          <w:sz w:val="24"/>
+          <w:szCs w:val="24"/>
+        </w:rPr>
+        <w:t>Kontrol ekranı tarayıcıda açılır. Program zaten açıksa dosyaya tekrar çift tıklamayın.</w:t>
+      </w:r>
+    </w:p>
+    <w:p>
+      <w:pPr>
+        <w:pStyle w:val="3"/>
         <w:keepNext w:val="0"/>
         <w:keepLines w:val="0"/>
         <w:widowControl/>
@@ -1194,63 +1064,31 @@
       <w:r>
         <w:rPr>
           <w:rFonts w:hint="default" w:ascii="Arial" w:hAnsi="Arial" w:cs="Arial"/>
-          <w:b/>
-          <w:bCs/>
-          <w:sz w:val="24"/>
-          <w:szCs w:val="24"/>
-          <w:lang w:val="tr-TR"/>
-        </w:rPr>
-        <w:t>Not:</w:t>
-      </w:r>
-      <w:r>
-        <w:rPr>
-          <w:rFonts w:hint="default" w:ascii="Arial" w:hAnsi="Arial" w:cs="Arial"/>
-          <w:sz w:val="24"/>
-          <w:szCs w:val="24"/>
-          <w:lang w:val="tr-TR"/>
-        </w:rPr>
-        <w:t xml:space="preserve"> </w:t>
-      </w:r>
-      <w:r>
-        <w:rPr>
-          <w:rFonts w:hint="default" w:ascii="Arial" w:hAnsi="Arial" w:cs="Arial"/>
-          <w:sz w:val="24"/>
-          <w:szCs w:val="24"/>
-        </w:rPr>
-        <w:t>Test devam ederken cihazı kullanmayın veya kablosunu çıkarmayın.</w:t>
-      </w:r>
-    </w:p>
-    <w:p>
-      <w:pPr>
-        <w:pStyle w:val="7"/>
-        <w:keepNext w:val="0"/>
-        <w:keepLines w:val="0"/>
-        <w:widowControl/>
-        <w:suppressLineNumbers w:val="0"/>
-        <w:rPr>
-          <w:rFonts w:hint="default" w:ascii="Arial" w:hAnsi="Arial" w:cs="Arial"/>
-          <w:b/>
-          <w:bCs/>
-          <w:sz w:val="24"/>
-          <w:szCs w:val="24"/>
-          <w:lang w:val="tr-TR"/>
-        </w:rPr>
-      </w:pPr>
-      <w:r>
-        <w:rPr>
-          <w:rFonts w:hint="default" w:ascii="Arial" w:hAnsi="Arial" w:cs="Arial"/>
-          <w:b/>
-          <w:bCs/>
-          <w:sz w:val="24"/>
-          <w:szCs w:val="24"/>
-          <w:lang w:val="tr-TR"/>
-        </w:rPr>
-        <w:t>Sistem Konumlandırma</w:t>
-      </w:r>
-    </w:p>
-    <w:p>
-      <w:pPr>
-        <w:pStyle w:val="7"/>
+          <w:sz w:val="24"/>
+          <w:szCs w:val="24"/>
+        </w:rPr>
+        <w:t xml:space="preserve">Testi </w:t>
+      </w:r>
+      <w:r>
+        <w:rPr>
+          <w:rFonts w:hint="default" w:ascii="Arial" w:hAnsi="Arial" w:cs="Arial"/>
+          <w:sz w:val="24"/>
+          <w:szCs w:val="24"/>
+          <w:lang w:val="tr-TR"/>
+        </w:rPr>
+        <w:t>B</w:t>
+      </w:r>
+      <w:r>
+        <w:rPr>
+          <w:rFonts w:hint="default" w:ascii="Arial" w:hAnsi="Arial" w:cs="Arial"/>
+          <w:sz w:val="24"/>
+          <w:szCs w:val="24"/>
+        </w:rPr>
+        <w:t>aşlatma</w:t>
+      </w:r>
+    </w:p>
+    <w:p>
+      <w:pPr>
         <w:keepNext w:val="0"/>
         <w:keepLines w:val="0"/>
         <w:widowControl/>
@@ -1259,31 +1097,92 @@
           <w:numId w:val="4"/>
         </w:numPr>
         <w:suppressLineNumbers w:val="0"/>
-        <w:ind w:left="420" w:leftChars="0" w:hanging="420" w:firstLineChars="0"/>
-        <w:rPr>
-          <w:rFonts w:hint="default" w:ascii="Arial" w:hAnsi="Arial" w:cs="Arial"/>
-          <w:b/>
-          <w:bCs/>
-          <w:sz w:val="24"/>
-          <w:szCs w:val="24"/>
-          <w:lang w:val="tr-TR"/>
-        </w:rPr>
-      </w:pPr>
-      <w:r>
-        <w:rPr>
-          <w:rFonts w:hint="default" w:ascii="Arial" w:hAnsi="Arial" w:cs="Arial"/>
-          <w:b w:val="0"/>
-          <w:bCs w:val="0"/>
-          <w:sz w:val="24"/>
-          <w:szCs w:val="24"/>
-          <w:lang w:val="tr-TR"/>
-        </w:rPr>
-        <w:t>Sistemler test edilirken kalibrasyon masası kullanılmalıdır.</w:t>
-      </w:r>
-    </w:p>
-    <w:p>
-      <w:pPr>
-        <w:pStyle w:val="7"/>
+        <w:spacing w:before="0" w:beforeAutospacing="1" w:after="0" w:afterAutospacing="1"/>
+        <w:ind w:left="720" w:hanging="360"/>
+        <w:rPr>
+          <w:rFonts w:hint="default" w:ascii="Arial" w:hAnsi="Arial" w:cs="Arial"/>
+          <w:sz w:val="24"/>
+          <w:szCs w:val="24"/>
+        </w:rPr>
+      </w:pPr>
+      <w:r>
+        <w:rPr>
+          <w:rFonts w:hint="default" w:ascii="Arial" w:hAnsi="Arial" w:cs="Arial"/>
+          <w:sz w:val="24"/>
+          <w:szCs w:val="24"/>
+          <w:lang w:val="tr-TR"/>
+        </w:rPr>
+        <w:t xml:space="preserve">Sistemi masa üstünde </w:t>
+      </w:r>
+      <w:r>
+        <w:rPr>
+          <w:rFonts w:hint="default" w:ascii="Arial" w:hAnsi="Arial" w:cs="Arial"/>
+          <w:sz w:val="24"/>
+          <w:szCs w:val="24"/>
+          <w:lang w:val="tr-TR"/>
+        </w:rPr>
+        <w:fldChar w:fldCharType="begin"/>
+      </w:r>
+      <w:r>
+        <w:rPr>
+          <w:rFonts w:hint="default" w:ascii="Arial" w:hAnsi="Arial" w:cs="Arial"/>
+          <w:sz w:val="24"/>
+          <w:szCs w:val="24"/>
+          <w:lang w:val="tr-TR"/>
+        </w:rPr>
+        <w:instrText xml:space="preserve"> REF _Ref24674 \h </w:instrText>
+      </w:r>
+      <w:r>
+        <w:rPr>
+          <w:rFonts w:hint="default" w:ascii="Arial" w:hAnsi="Arial" w:cs="Arial"/>
+          <w:sz w:val="24"/>
+          <w:szCs w:val="24"/>
+          <w:lang w:val="tr-TR"/>
+        </w:rPr>
+        <w:fldChar w:fldCharType="separate"/>
+      </w:r>
+      <w:r>
+        <w:rPr>
+          <w:rFonts w:hint="default" w:ascii="Arial" w:hAnsi="Arial" w:cs="Arial"/>
+          <w:b/>
+          <w:bCs/>
+          <w:sz w:val="24"/>
+          <w:szCs w:val="24"/>
+          <w:lang w:val="tr-TR"/>
+        </w:rPr>
+        <w:t>Şekil</w:t>
+      </w:r>
+      <w:r>
+        <w:rPr>
+          <w:rFonts w:hint="default" w:ascii="Arial" w:hAnsi="Arial" w:cs="Arial"/>
+          <w:b/>
+          <w:bCs/>
+          <w:sz w:val="24"/>
+          <w:szCs w:val="24"/>
+        </w:rPr>
+        <w:t xml:space="preserve"> 3</w:t>
+      </w:r>
+      <w:r>
+        <w:rPr>
+          <w:rFonts w:hint="default" w:ascii="Arial" w:hAnsi="Arial" w:cs="Arial"/>
+          <w:sz w:val="24"/>
+          <w:szCs w:val="24"/>
+          <w:lang w:val="tr-TR"/>
+        </w:rPr>
+        <w:fldChar w:fldCharType="end"/>
+      </w:r>
+      <w:r>
+        <w:rPr>
+          <w:rFonts w:hint="default" w:ascii="Arial" w:hAnsi="Arial" w:cs="Arial"/>
+          <w:sz w:val="24"/>
+          <w:szCs w:val="24"/>
+          <w:lang w:val="tr-TR"/>
+        </w:rPr>
+        <w:t>’te gösterilen şekilde konumlandırın.</w:t>
+      </w:r>
+    </w:p>
+    <w:p>
+      <w:pPr>
         <w:keepNext w:val="0"/>
         <w:keepLines w:val="0"/>
         <w:widowControl/>
@@ -1292,26 +1191,100 @@
           <w:numId w:val="4"/>
         </w:numPr>
         <w:suppressLineNumbers w:val="0"/>
-        <w:ind w:left="420" w:leftChars="0" w:hanging="420" w:firstLineChars="0"/>
-        <w:rPr>
-          <w:rFonts w:hint="default" w:ascii="Arial" w:hAnsi="Arial" w:cs="Arial"/>
-          <w:b/>
-          <w:bCs/>
-          <w:sz w:val="24"/>
-          <w:szCs w:val="24"/>
-          <w:lang w:val="tr-TR"/>
-        </w:rPr>
-      </w:pPr>
-      <w:r>
-        <w:rPr>
-          <w:rFonts w:hint="default" w:ascii="Arial" w:hAnsi="Arial" w:cs="Arial"/>
-          <w:b w:val="0"/>
-          <w:bCs w:val="0"/>
-          <w:sz w:val="24"/>
-          <w:szCs w:val="24"/>
-          <w:lang w:val="tr-TR"/>
-        </w:rPr>
-        <w:t xml:space="preserve">Sistemlerin sabitlendiği U şekildedi tutucu kullanılır. </w:t>
+        <w:spacing w:before="0" w:beforeAutospacing="1" w:after="0" w:afterAutospacing="1"/>
+        <w:ind w:left="720" w:hanging="360"/>
+        <w:rPr>
+          <w:rFonts w:hint="default" w:ascii="Arial" w:hAnsi="Arial" w:cs="Arial"/>
+          <w:sz w:val="24"/>
+          <w:szCs w:val="24"/>
+        </w:rPr>
+      </w:pPr>
+      <w:r>
+        <w:rPr>
+          <w:rStyle w:val="8"/>
+          <w:rFonts w:hint="default" w:ascii="Arial" w:hAnsi="Arial" w:cs="Arial"/>
+          <w:sz w:val="24"/>
+          <w:szCs w:val="24"/>
+        </w:rPr>
+        <w:t>Başlat</w:t>
+      </w:r>
+      <w:r>
+        <w:rPr>
+          <w:rFonts w:hint="default" w:ascii="Arial" w:hAnsi="Arial" w:cs="Arial"/>
+          <w:sz w:val="24"/>
+          <w:szCs w:val="24"/>
+        </w:rPr>
+        <w:t xml:space="preserve"> düğmesine basın.</w:t>
+      </w:r>
+    </w:p>
+    <w:p>
+      <w:pPr>
+        <w:pStyle w:val="7"/>
+        <w:keepNext w:val="0"/>
+        <w:keepLines w:val="0"/>
+        <w:widowControl/>
+        <w:suppressLineNumbers w:val="0"/>
+        <w:rPr>
+          <w:rFonts w:hint="default" w:ascii="Arial" w:hAnsi="Arial" w:cs="Arial"/>
+          <w:sz w:val="24"/>
+          <w:szCs w:val="24"/>
+        </w:rPr>
+      </w:pPr>
+      <w:r>
+        <w:rPr>
+          <w:rFonts w:hint="default" w:ascii="Arial" w:hAnsi="Arial" w:cs="Arial"/>
+          <w:b/>
+          <w:bCs/>
+          <w:sz w:val="24"/>
+          <w:szCs w:val="24"/>
+          <w:lang w:val="tr-TR"/>
+        </w:rPr>
+        <w:t>Not:</w:t>
+      </w:r>
+      <w:r>
+        <w:rPr>
+          <w:rFonts w:hint="default" w:ascii="Arial" w:hAnsi="Arial" w:cs="Arial"/>
+          <w:sz w:val="24"/>
+          <w:szCs w:val="24"/>
+          <w:lang w:val="tr-TR"/>
+        </w:rPr>
+        <w:t xml:space="preserve"> </w:t>
+      </w:r>
+      <w:r>
+        <w:rPr>
+          <w:rFonts w:hint="default" w:ascii="Arial" w:hAnsi="Arial" w:cs="Arial"/>
+          <w:sz w:val="24"/>
+          <w:szCs w:val="24"/>
+        </w:rPr>
+        <w:t>Test devam ederken cihazı kullanmayın veya kablosunu çıkarmayın.</w:t>
+      </w:r>
+    </w:p>
+    <w:p>
+      <w:pPr>
+        <w:pStyle w:val="7"/>
+        <w:keepNext w:val="0"/>
+        <w:keepLines w:val="0"/>
+        <w:widowControl/>
+        <w:suppressLineNumbers w:val="0"/>
+        <w:rPr>
+          <w:rFonts w:hint="default" w:ascii="Arial" w:hAnsi="Arial" w:cs="Arial"/>
+          <w:b/>
+          <w:bCs/>
+          <w:sz w:val="24"/>
+          <w:szCs w:val="24"/>
+          <w:lang w:val="tr-TR"/>
+        </w:rPr>
+      </w:pPr>
+      <w:r>
+        <w:rPr>
+          <w:rFonts w:hint="default" w:ascii="Arial" w:hAnsi="Arial" w:cs="Arial"/>
+          <w:b/>
+          <w:bCs/>
+          <w:sz w:val="24"/>
+          <w:szCs w:val="24"/>
+          <w:lang w:val="tr-TR"/>
+        </w:rPr>
+        <w:t>Sistem Konumlandırma</w:t>
       </w:r>
     </w:p>
     <w:p>
@@ -1322,7 +1295,7 @@
         <w:widowControl/>
         <w:numPr>
           <w:ilvl w:val="0"/>
-          <w:numId w:val="4"/>
+          <w:numId w:val="5"/>
         </w:numPr>
         <w:suppressLineNumbers w:val="0"/>
         <w:ind w:left="420" w:leftChars="0" w:hanging="420" w:firstLineChars="0"/>
@@ -1344,7 +1317,7 @@
           <w:szCs w:val="24"/>
           <w:lang w:val="tr-TR"/>
         </w:rPr>
-        <w:t xml:space="preserve">M2GR ve S3A sistemi için konumlandırma Yapılacaklar kutusunda gösterilmiştir. </w:t>
+        <w:t>Sistemler test edilirken kalibrasyon masası kullanılmalıdır.</w:t>
       </w:r>
     </w:p>
     <w:p>
@@ -1355,7 +1328,7 @@
         <w:widowControl/>
         <w:numPr>
           <w:ilvl w:val="0"/>
-          <w:numId w:val="4"/>
+          <w:numId w:val="5"/>
         </w:numPr>
         <w:suppressLineNumbers w:val="0"/>
         <w:ind w:left="420" w:leftChars="0" w:hanging="420" w:firstLineChars="0"/>
@@ -1377,7 +1350,7 @@
           <w:szCs w:val="24"/>
           <w:lang w:val="tr-TR"/>
         </w:rPr>
-        <w:t>Test 05, 06 ve 07’de konumlandırma yapılmaktadır.</w:t>
+        <w:t xml:space="preserve">Sistemlerin sabitlendiği U şekildedi tutucu kullanılır. </w:t>
       </w:r>
     </w:p>
     <w:p>
@@ -1387,6 +1360,73 @@
         <w:keepLines w:val="0"/>
         <w:widowControl/>
         <w:numPr>
+          <w:ilvl w:val="0"/>
+          <w:numId w:val="5"/>
+        </w:numPr>
+        <w:suppressLineNumbers w:val="0"/>
+        <w:ind w:left="420" w:leftChars="0" w:hanging="420" w:firstLineChars="0"/>
+        <w:rPr>
+          <w:rFonts w:hint="default" w:ascii="Arial" w:hAnsi="Arial" w:cs="Arial"/>
+          <w:b/>
+          <w:bCs/>
+          <w:sz w:val="24"/>
+          <w:szCs w:val="24"/>
+          <w:lang w:val="tr-TR"/>
+        </w:rPr>
+      </w:pPr>
+      <w:r>
+        <w:rPr>
+          <w:rFonts w:hint="default" w:ascii="Arial" w:hAnsi="Arial" w:cs="Arial"/>
+          <w:b w:val="0"/>
+          <w:bCs w:val="0"/>
+          <w:sz w:val="24"/>
+          <w:szCs w:val="24"/>
+          <w:lang w:val="tr-TR"/>
+        </w:rPr>
+        <w:t xml:space="preserve">M2GR ve S3A sistemi için konumlandırma Yapılacaklar kutusunda gösterilmiştir. </w:t>
+      </w:r>
+    </w:p>
+    <w:p>
+      <w:pPr>
+        <w:pStyle w:val="7"/>
+        <w:keepNext w:val="0"/>
+        <w:keepLines w:val="0"/>
+        <w:widowControl/>
+        <w:numPr>
+          <w:ilvl w:val="0"/>
+          <w:numId w:val="5"/>
+        </w:numPr>
+        <w:suppressLineNumbers w:val="0"/>
+        <w:ind w:left="420" w:leftChars="0" w:hanging="420" w:firstLineChars="0"/>
+        <w:rPr>
+          <w:rFonts w:hint="default" w:ascii="Arial" w:hAnsi="Arial" w:cs="Arial"/>
+          <w:b/>
+          <w:bCs/>
+          <w:sz w:val="24"/>
+          <w:szCs w:val="24"/>
+          <w:lang w:val="tr-TR"/>
+        </w:rPr>
+      </w:pPr>
+      <w:r>
+        <w:rPr>
+          <w:rFonts w:hint="default" w:ascii="Arial" w:hAnsi="Arial" w:cs="Arial"/>
+          <w:b w:val="0"/>
+          <w:bCs w:val="0"/>
+          <w:sz w:val="24"/>
+          <w:szCs w:val="24"/>
+          <w:lang w:val="tr-TR"/>
+        </w:rPr>
+        <w:t>Test 05, 06 ve 07’de konumlandırma yapılmaktadır.</w:t>
+      </w:r>
+    </w:p>
+    <w:p>
+      <w:pPr>
+        <w:pStyle w:val="7"/>
+        <w:keepNext w:val="0"/>
+        <w:keepLines w:val="0"/>
+        <w:widowControl/>
+        <w:numPr>
+          <w:ilvl w:val="0"/>
           <w:numId w:val="0"/>
         </w:numPr>
         <w:suppressLineNumbers w:val="0"/>
@@ -1413,8 +1453,8 @@
         </w:rPr>
         <w:drawing>
           <wp:inline distT="0" distB="0" distL="114300" distR="114300">
-            <wp:extent cx="2768600" cy="2474595"/>
-            <wp:effectExtent l="0" t="0" r="5080" b="9525"/>
+            <wp:extent cx="2353945" cy="2103755"/>
+            <wp:effectExtent l="0" t="0" r="8255" b="14605"/>
             <wp:docPr id="5" name="Picture 5" descr="konum_1"/>
             <wp:cNvGraphicFramePr>
               <a:graphicFrameLocks xmlns:a="http://schemas.openxmlformats.org/drawingml/2006/main" noChangeAspect="1"/>
@@ -1438,7 +1478,7 @@
                   <pic:spPr>
                     <a:xfrm>
                       <a:off x="0" y="0"/>
-                      <a:ext cx="2768600" cy="2474595"/>
+                      <a:ext cx="2353945" cy="2103755"/>
                     </a:xfrm>
                     <a:prstGeom prst="rect">
                       <a:avLst/>
@@ -1469,6 +1509,7 @@
         <w:keepLines w:val="0"/>
         <w:widowControl/>
         <w:numPr>
+          <w:ilvl w:val="0"/>
           <w:numId w:val="0"/>
         </w:numPr>
         <w:suppressLineNumbers w:val="0"/>
@@ -1476,35 +1517,21 @@
         <w:ind w:right="0" w:rightChars="0"/>
         <w:jc w:val="center"/>
         <w:rPr>
-          <w:rFonts w:hint="default" w:ascii="Arial" w:hAnsi="Arial" w:cs="Arial"/>
-          <w:b/>
-          <w:bCs/>
-          <w:sz w:val="24"/>
-          <w:szCs w:val="24"/>
-          <w:lang w:val="tr-TR"/>
-        </w:rPr>
-      </w:pPr>
-      <w:r>
-        <w:rPr>
-          <w:rFonts w:hint="default" w:ascii="Arial" w:hAnsi="Arial" w:cs="Arial"/>
-          <w:b/>
-          <w:bCs/>
-          <w:sz w:val="24"/>
-          <w:szCs w:val="24"/>
-          <w:lang w:val="tr-TR"/>
-        </w:rPr>
-        <w:t>Ş</w:t>
-      </w:r>
-      <w:r>
-        <w:rPr>
-          <w:rFonts w:hint="default" w:ascii="Arial" w:hAnsi="Arial" w:cs="Arial"/>
-          <w:b/>
-          <w:bCs/>
-          <w:sz w:val="24"/>
-          <w:szCs w:val="24"/>
-          <w:lang w:val="tr-TR"/>
-        </w:rPr>
-        <w:t>ekil</w:t>
+          <w:rFonts w:hint="default"/>
+          <w:lang w:val="tr-TR"/>
+        </w:rPr>
+      </w:pPr>
+      <w:bookmarkStart w:id="2" w:name="_Ref24674"/>
+      <w:r>
+        <w:rPr>
+          <w:rFonts w:hint="default" w:ascii="Arial" w:hAnsi="Arial" w:cs="Arial"/>
+          <w:b/>
+          <w:bCs/>
+          <w:sz w:val="24"/>
+          <w:szCs w:val="24"/>
+          <w:lang w:val="tr-TR"/>
+        </w:rPr>
+        <w:t>Şekil</w:t>
       </w:r>
       <w:r>
         <w:rPr>
@@ -1577,22 +1604,7 @@
         </w:rPr>
         <w:t>: Konum 1</w:t>
       </w:r>
-    </w:p>
-    <w:p>
-      <w:pPr>
-        <w:rPr>
-          <w:rFonts w:hint="default"/>
-          <w:lang w:val="tr-TR"/>
-        </w:rPr>
-      </w:pPr>
-    </w:p>
-    <w:p>
-      <w:pPr>
-        <w:rPr>
-          <w:rFonts w:hint="default"/>
-          <w:lang w:val="tr-TR"/>
-        </w:rPr>
-      </w:pPr>
+      <w:bookmarkEnd w:id="2"/>
     </w:p>
     <w:p>
       <w:pPr>
@@ -2619,15 +2631,1143 @@
         </w:rPr>
         <w:t xml:space="preserve">Teste ait sonuçlar hem GUI ile hem de “Test Sonuçları” klasöründe gözlemlenir. </w:t>
       </w:r>
-      <w:bookmarkStart w:id="2" w:name="_GoBack"/>
-      <w:bookmarkEnd w:id="2"/>
-    </w:p>
-    <w:p>
-      <w:pPr>
-        <w:rPr>
-          <w:rFonts w:hint="default" w:ascii="Arial" w:hAnsi="Arial" w:cs="Arial"/>
-          <w:sz w:val="24"/>
-          <w:szCs w:val="24"/>
+    </w:p>
+    <w:p>
+      <w:pPr>
+        <w:rPr>
+          <w:rFonts w:hint="default" w:ascii="Arial" w:hAnsi="Arial" w:cs="Arial"/>
+          <w:sz w:val="24"/>
+          <w:szCs w:val="24"/>
+          <w:lang w:val="tr-TR"/>
+        </w:rPr>
+      </w:pPr>
+    </w:p>
+    <w:p>
+      <w:pPr>
+        <w:numPr>
+          <w:ilvl w:val="0"/>
+          <w:numId w:val="5"/>
+        </w:numPr>
+        <w:ind w:left="420" w:leftChars="0" w:hanging="420" w:firstLineChars="0"/>
+        <w:rPr>
+          <w:rFonts w:hint="default" w:ascii="Arial" w:hAnsi="Arial" w:cs="Arial"/>
+          <w:sz w:val="24"/>
+          <w:szCs w:val="24"/>
+          <w:lang w:val="tr-TR"/>
+        </w:rPr>
+      </w:pPr>
+      <w:r>
+        <w:rPr>
+          <w:rFonts w:hint="default" w:ascii="Arial" w:hAnsi="Arial" w:cs="Arial"/>
+          <w:sz w:val="24"/>
+          <w:szCs w:val="24"/>
+          <w:lang w:val="tr-TR"/>
+        </w:rPr>
+        <w:t>Testleri başarı ile tamamlanan M2GR sistemlerine M2GR anten testleri uygulanır.</w:t>
+      </w:r>
+    </w:p>
+    <w:p>
+      <w:pPr>
+        <w:numPr>
+          <w:ilvl w:val="0"/>
+          <w:numId w:val="5"/>
+        </w:numPr>
+        <w:ind w:left="420" w:leftChars="0" w:hanging="420" w:firstLineChars="0"/>
+        <w:rPr>
+          <w:rFonts w:hint="default" w:ascii="Arial" w:hAnsi="Arial" w:cs="Arial"/>
+          <w:sz w:val="24"/>
+          <w:szCs w:val="24"/>
+          <w:lang w:val="tr-TR"/>
+        </w:rPr>
+      </w:pPr>
+      <w:r>
+        <w:rPr>
+          <w:rFonts w:hint="default" w:ascii="Arial" w:hAnsi="Arial" w:cs="Arial"/>
+          <w:sz w:val="24"/>
+          <w:szCs w:val="24"/>
+          <w:lang w:val="tr-TR"/>
+        </w:rPr>
+        <w:t>Testleri başarı ile tamamlanan S3A sistemlerine manyetometre kalibrasyonu yapılmalıdır. Kalibrasyon sonrası Magn testleri uygulanır.</w:t>
+      </w:r>
+    </w:p>
+    <w:p>
+      <w:pPr>
+        <w:rPr>
+          <w:rFonts w:hint="default" w:ascii="Arial" w:hAnsi="Arial" w:cs="Arial"/>
+          <w:sz w:val="24"/>
+          <w:szCs w:val="24"/>
+          <w:lang w:val="tr-TR"/>
+        </w:rPr>
+      </w:pPr>
+    </w:p>
+    <w:p>
+      <w:pPr>
+        <w:rPr>
+          <w:rFonts w:hint="default" w:ascii="Arial" w:hAnsi="Arial" w:cs="Arial"/>
+          <w:sz w:val="24"/>
+          <w:szCs w:val="24"/>
+          <w:lang w:val="tr-TR"/>
+        </w:rPr>
+      </w:pPr>
+    </w:p>
+    <w:p>
+      <w:pPr>
+        <w:rPr>
+          <w:rFonts w:hint="default" w:ascii="Arial" w:hAnsi="Arial" w:cs="Arial"/>
+          <w:sz w:val="24"/>
+          <w:szCs w:val="24"/>
+          <w:lang w:val="tr-TR"/>
+        </w:rPr>
+      </w:pPr>
+    </w:p>
+    <w:p>
+      <w:pPr>
+        <w:rPr>
+          <w:rFonts w:hint="default" w:ascii="Arial" w:hAnsi="Arial" w:cs="Arial"/>
+          <w:sz w:val="24"/>
+          <w:szCs w:val="24"/>
+          <w:lang w:val="tr-TR"/>
+        </w:rPr>
+      </w:pPr>
+    </w:p>
+    <w:p>
+      <w:pPr>
+        <w:rPr>
+          <w:rFonts w:hint="default" w:ascii="Arial" w:hAnsi="Arial" w:cs="Arial"/>
+          <w:sz w:val="24"/>
+          <w:szCs w:val="24"/>
+          <w:lang w:val="tr-TR"/>
+        </w:rPr>
+      </w:pPr>
+    </w:p>
+    <w:p>
+      <w:pPr>
+        <w:rPr>
+          <w:rFonts w:hint="default" w:ascii="Arial" w:hAnsi="Arial" w:cs="Arial"/>
+          <w:sz w:val="24"/>
+          <w:szCs w:val="24"/>
+          <w:lang w:val="tr-TR"/>
+        </w:rPr>
+      </w:pPr>
+    </w:p>
+    <w:p>
+      <w:pPr>
+        <w:rPr>
+          <w:rFonts w:hint="default" w:ascii="Arial" w:hAnsi="Arial" w:cs="Arial"/>
+          <w:sz w:val="24"/>
+          <w:szCs w:val="24"/>
+          <w:lang w:val="tr-TR"/>
+        </w:rPr>
+      </w:pPr>
+    </w:p>
+    <w:p>
+      <w:pPr>
+        <w:numPr>
+          <w:ilvl w:val="0"/>
+          <w:numId w:val="1"/>
+        </w:numPr>
+        <w:ind w:left="425" w:leftChars="0" w:hanging="425" w:firstLineChars="0"/>
+        <w:rPr>
+          <w:rFonts w:hint="default" w:ascii="Arial" w:hAnsi="Arial" w:cs="Arial"/>
+          <w:b/>
+          <w:bCs/>
+          <w:sz w:val="24"/>
+          <w:szCs w:val="24"/>
+          <w:lang w:val="tr-TR"/>
+        </w:rPr>
+      </w:pPr>
+      <w:r>
+        <w:rPr>
+          <w:rFonts w:hint="default" w:ascii="Arial" w:hAnsi="Arial" w:cs="Arial"/>
+          <w:b/>
+          <w:bCs/>
+          <w:sz w:val="24"/>
+          <w:szCs w:val="24"/>
+          <w:lang w:val="tr-TR"/>
+        </w:rPr>
+        <w:t>M2GR Anten Testi</w:t>
+      </w:r>
+    </w:p>
+    <w:p>
+      <w:pPr>
+        <w:rPr>
+          <w:rFonts w:hint="default" w:ascii="Arial" w:hAnsi="Arial" w:cs="Arial"/>
+          <w:b/>
+          <w:bCs/>
+          <w:sz w:val="24"/>
+          <w:szCs w:val="24"/>
+          <w:lang w:val="tr-TR"/>
+        </w:rPr>
+      </w:pPr>
+    </w:p>
+    <w:p>
+      <w:pPr>
+        <w:jc w:val="center"/>
+        <w:rPr>
+          <w:b/>
+          <w:bCs/>
+        </w:rPr>
+      </w:pPr>
+      <w:r>
+        <w:rPr>
+          <w:b/>
+          <w:bCs/>
+        </w:rPr>
+        <w:drawing>
+          <wp:inline distT="0" distB="0" distL="114300" distR="114300">
+            <wp:extent cx="5272405" cy="329565"/>
+            <wp:effectExtent l="0" t="0" r="635" b="5715"/>
+            <wp:docPr id="1" name="Picture 1"/>
+            <wp:cNvGraphicFramePr>
+              <a:graphicFrameLocks xmlns:a="http://schemas.openxmlformats.org/drawingml/2006/main" noChangeAspect="1"/>
+            </wp:cNvGraphicFramePr>
+            <a:graphic xmlns:a="http://schemas.openxmlformats.org/drawingml/2006/main">
+              <a:graphicData uri="http://schemas.openxmlformats.org/drawingml/2006/picture">
+                <pic:pic xmlns:pic="http://schemas.openxmlformats.org/drawingml/2006/picture">
+                  <pic:nvPicPr>
+                    <pic:cNvPr id="1" name="Picture 1"/>
+                    <pic:cNvPicPr>
+                      <a:picLocks noChangeAspect="1"/>
+                    </pic:cNvPicPr>
+                  </pic:nvPicPr>
+                  <pic:blipFill>
+                    <a:blip r:embed="rId12"/>
+                    <a:stretch>
+                      <a:fillRect/>
+                    </a:stretch>
+                  </pic:blipFill>
+                  <pic:spPr>
+                    <a:xfrm>
+                      <a:off x="0" y="0"/>
+                      <a:ext cx="5272405" cy="329565"/>
+                    </a:xfrm>
+                    <a:prstGeom prst="rect">
+                      <a:avLst/>
+                    </a:prstGeom>
+                    <a:noFill/>
+                    <a:ln>
+                      <a:noFill/>
+                    </a:ln>
+                  </pic:spPr>
+                </pic:pic>
+              </a:graphicData>
+            </a:graphic>
+          </wp:inline>
+        </w:drawing>
+      </w:r>
+    </w:p>
+    <w:p>
+      <w:pPr>
+        <w:pStyle w:val="6"/>
+        <w:jc w:val="center"/>
+        <w:rPr>
+          <w:rFonts w:hint="default"/>
+          <w:b/>
+          <w:bCs/>
+          <w:lang w:val="tr-TR"/>
+        </w:rPr>
+      </w:pPr>
+      <w:bookmarkStart w:id="3" w:name="_Ref18545"/>
+      <w:r>
+        <w:rPr>
+          <w:b/>
+          <w:bCs/>
+          <w:lang w:val="tr-TR"/>
+        </w:rPr>
+        <w:t>Ş</w:t>
+      </w:r>
+      <w:r>
+        <w:rPr>
+          <w:rFonts w:hint="default"/>
+          <w:b/>
+          <w:bCs/>
+          <w:lang w:val="tr-TR"/>
+        </w:rPr>
+        <w:t>ekil</w:t>
+      </w:r>
+      <w:r>
+        <w:rPr>
+          <w:b/>
+          <w:bCs/>
+        </w:rPr>
+        <w:t xml:space="preserve"> </w:t>
+      </w:r>
+      <w:r>
+        <w:rPr>
+          <w:b/>
+          <w:bCs/>
+        </w:rPr>
+        <w:fldChar w:fldCharType="begin"/>
+      </w:r>
+      <w:r>
+        <w:rPr>
+          <w:b/>
+          <w:bCs/>
+        </w:rPr>
+        <w:instrText xml:space="preserve"> SEQ Figure \* ARABIC </w:instrText>
+      </w:r>
+      <w:r>
+        <w:rPr>
+          <w:b/>
+          <w:bCs/>
+        </w:rPr>
+        <w:fldChar w:fldCharType="separate"/>
+      </w:r>
+      <w:r>
+        <w:rPr>
+          <w:b/>
+          <w:bCs/>
+        </w:rPr>
+        <w:t>9</w:t>
+      </w:r>
+      <w:r>
+        <w:rPr>
+          <w:b/>
+          <w:bCs/>
+        </w:rPr>
+        <w:fldChar w:fldCharType="end"/>
+      </w:r>
+      <w:r>
+        <w:rPr>
+          <w:rFonts w:hint="default"/>
+          <w:b/>
+          <w:bCs/>
+          <w:lang w:val="tr-TR"/>
+        </w:rPr>
+        <w:t>: Anten/RTK Test Modu Seçimi</w:t>
+      </w:r>
+      <w:bookmarkEnd w:id="3"/>
+    </w:p>
+    <w:p>
+      <w:pPr>
+        <w:rPr>
+          <w:rFonts w:hint="default" w:ascii="Arial" w:hAnsi="Arial" w:cs="Arial"/>
+          <w:sz w:val="24"/>
+          <w:szCs w:val="24"/>
+        </w:rPr>
+      </w:pPr>
+    </w:p>
+    <w:p>
+      <w:pPr>
+        <w:numPr>
+          <w:ilvl w:val="0"/>
+          <w:numId w:val="5"/>
+        </w:numPr>
+        <w:ind w:left="420" w:leftChars="0" w:hanging="420" w:firstLineChars="0"/>
+        <w:rPr>
+          <w:rFonts w:hint="default" w:ascii="Arial" w:hAnsi="Arial" w:cs="Arial"/>
+          <w:sz w:val="24"/>
+          <w:szCs w:val="24"/>
+          <w:lang w:val="tr-TR"/>
+        </w:rPr>
+      </w:pPr>
+      <w:r>
+        <w:rPr>
+          <w:rFonts w:hint="default" w:ascii="Arial" w:hAnsi="Arial" w:cs="Arial"/>
+          <w:sz w:val="24"/>
+          <w:szCs w:val="24"/>
+          <w:lang w:val="tr-TR"/>
+        </w:rPr>
+        <w:t>M2GR sisteminden M2GR Kalibrasyon Sonrası testleri başarı ile tamamlandıktan sonra Anten/RTK testleri yapılır.</w:t>
+      </w:r>
+    </w:p>
+    <w:p>
+      <w:pPr>
+        <w:rPr>
+          <w:rFonts w:hint="default" w:ascii="Arial" w:hAnsi="Arial" w:cs="Arial"/>
+          <w:sz w:val="24"/>
+          <w:szCs w:val="24"/>
+          <w:lang w:val="tr-TR"/>
+        </w:rPr>
+      </w:pPr>
+    </w:p>
+    <w:p>
+      <w:pPr>
+        <w:numPr>
+          <w:ilvl w:val="0"/>
+          <w:numId w:val="5"/>
+        </w:numPr>
+        <w:ind w:left="420" w:leftChars="0" w:hanging="420" w:firstLineChars="0"/>
+        <w:rPr>
+          <w:rFonts w:hint="default" w:ascii="Arial" w:hAnsi="Arial" w:cs="Arial"/>
+          <w:sz w:val="24"/>
+          <w:szCs w:val="24"/>
+          <w:lang w:val="tr-TR"/>
+        </w:rPr>
+      </w:pPr>
+      <w:r>
+        <w:rPr>
+          <w:rFonts w:hint="default" w:ascii="Arial" w:hAnsi="Arial" w:cs="Arial"/>
+          <w:sz w:val="24"/>
+          <w:szCs w:val="24"/>
+          <w:lang w:val="tr-TR"/>
+        </w:rPr>
+        <w:fldChar w:fldCharType="begin"/>
+      </w:r>
+      <w:r>
+        <w:rPr>
+          <w:rFonts w:hint="default" w:ascii="Arial" w:hAnsi="Arial" w:cs="Arial"/>
+          <w:sz w:val="24"/>
+          <w:szCs w:val="24"/>
+          <w:lang w:val="tr-TR"/>
+        </w:rPr>
+        <w:instrText xml:space="preserve"> REF _Ref18545 \h </w:instrText>
+      </w:r>
+      <w:r>
+        <w:rPr>
+          <w:rFonts w:hint="default" w:ascii="Arial" w:hAnsi="Arial" w:cs="Arial"/>
+          <w:sz w:val="24"/>
+          <w:szCs w:val="24"/>
+          <w:lang w:val="tr-TR"/>
+        </w:rPr>
+        <w:fldChar w:fldCharType="separate"/>
+      </w:r>
+      <w:r>
+        <w:rPr>
+          <w:rFonts w:hint="default" w:ascii="Arial" w:hAnsi="Arial" w:cs="Arial"/>
+          <w:b/>
+          <w:bCs/>
+          <w:sz w:val="24"/>
+          <w:szCs w:val="24"/>
+          <w:lang w:val="tr-TR"/>
+        </w:rPr>
+        <w:t>Şekil</w:t>
+      </w:r>
+      <w:r>
+        <w:rPr>
+          <w:rFonts w:hint="default" w:ascii="Arial" w:hAnsi="Arial" w:cs="Arial"/>
+          <w:b/>
+          <w:bCs/>
+          <w:sz w:val="24"/>
+          <w:szCs w:val="24"/>
+        </w:rPr>
+        <w:t xml:space="preserve"> 9</w:t>
+      </w:r>
+      <w:r>
+        <w:rPr>
+          <w:rFonts w:hint="default" w:ascii="Arial" w:hAnsi="Arial" w:cs="Arial"/>
+          <w:sz w:val="24"/>
+          <w:szCs w:val="24"/>
+          <w:lang w:val="tr-TR"/>
+        </w:rPr>
+        <w:fldChar w:fldCharType="end"/>
+      </w:r>
+      <w:r>
+        <w:rPr>
+          <w:rFonts w:hint="default" w:ascii="Arial" w:hAnsi="Arial" w:cs="Arial"/>
+          <w:sz w:val="24"/>
+          <w:szCs w:val="24"/>
+          <w:lang w:val="tr-TR"/>
+        </w:rPr>
+        <w:t xml:space="preserve"> ile gösterilen mod tuşuna basılır. Cihaza ait PN ve SN girilir. Sisteme anten bağlantısı yapılır ve anten bağlantısı yapıldığı GUI ile onaylanır. </w:t>
+      </w:r>
+    </w:p>
+    <w:p>
+      <w:pPr>
+        <w:rPr>
+          <w:rFonts w:hint="default" w:ascii="Arial" w:hAnsi="Arial" w:cs="Arial"/>
+          <w:b/>
+          <w:bCs/>
+          <w:sz w:val="24"/>
+          <w:szCs w:val="24"/>
+          <w:lang w:val="tr-TR"/>
+        </w:rPr>
+      </w:pPr>
+    </w:p>
+    <w:p>
+      <w:pPr>
+        <w:numPr>
+          <w:ilvl w:val="0"/>
+          <w:numId w:val="5"/>
+        </w:numPr>
+        <w:ind w:left="420" w:leftChars="0" w:hanging="420" w:firstLineChars="0"/>
+        <w:rPr>
+          <w:rFonts w:hint="default" w:ascii="Arial" w:hAnsi="Arial" w:cs="Arial"/>
+          <w:b w:val="0"/>
+          <w:bCs w:val="0"/>
+          <w:sz w:val="24"/>
+          <w:szCs w:val="24"/>
+          <w:lang w:val="tr-TR"/>
+        </w:rPr>
+      </w:pPr>
+      <w:r>
+        <w:rPr>
+          <w:rFonts w:hint="default" w:ascii="Arial" w:hAnsi="Arial" w:cs="Arial"/>
+          <w:b/>
+          <w:bCs/>
+          <w:sz w:val="24"/>
+          <w:szCs w:val="24"/>
+          <w:lang w:val="tr-TR"/>
+        </w:rPr>
+        <w:t>Başlat</w:t>
+      </w:r>
+      <w:r>
+        <w:rPr>
+          <w:rFonts w:hint="default" w:ascii="Arial" w:hAnsi="Arial" w:cs="Arial"/>
+          <w:b w:val="0"/>
+          <w:bCs w:val="0"/>
+          <w:sz w:val="24"/>
+          <w:szCs w:val="24"/>
+          <w:lang w:val="tr-TR"/>
+        </w:rPr>
+        <w:t xml:space="preserve"> butonu ile test başlatılır.</w:t>
+      </w:r>
+    </w:p>
+    <w:p>
+      <w:pPr>
+        <w:rPr>
+          <w:rFonts w:hint="default" w:ascii="Arial" w:hAnsi="Arial" w:cs="Arial"/>
+          <w:b w:val="0"/>
+          <w:bCs w:val="0"/>
+          <w:sz w:val="24"/>
+          <w:szCs w:val="24"/>
+          <w:lang w:val="tr-TR"/>
+        </w:rPr>
+      </w:pPr>
+    </w:p>
+    <w:p>
+      <w:pPr>
+        <w:numPr>
+          <w:ilvl w:val="0"/>
+          <w:numId w:val="5"/>
+        </w:numPr>
+        <w:ind w:left="420" w:leftChars="0" w:hanging="420" w:firstLineChars="0"/>
+        <w:rPr>
+          <w:rFonts w:hint="default" w:ascii="Arial" w:hAnsi="Arial" w:cs="Arial"/>
+          <w:b w:val="0"/>
+          <w:bCs w:val="0"/>
+          <w:sz w:val="24"/>
+          <w:szCs w:val="24"/>
+          <w:lang w:val="tr-TR"/>
+        </w:rPr>
+      </w:pPr>
+      <w:r>
+        <w:rPr>
+          <w:rFonts w:hint="default" w:ascii="Arial" w:hAnsi="Arial" w:cs="Arial"/>
+          <w:b w:val="0"/>
+          <w:bCs w:val="0"/>
+          <w:sz w:val="24"/>
+          <w:szCs w:val="24"/>
+          <w:lang w:val="tr-TR"/>
+        </w:rPr>
+        <w:t>Test tamamlandıktan sonra “Anten Testi Sonuçları” klasöründe “AntenTestiSonucları.xlsx” dosyası ile sonuçlar gözlemlenir.</w:t>
+      </w:r>
+    </w:p>
+    <w:p>
+      <w:pPr>
+        <w:rPr>
+          <w:rFonts w:hint="default" w:ascii="Arial" w:hAnsi="Arial" w:cs="Arial"/>
+          <w:b w:val="0"/>
+          <w:bCs w:val="0"/>
+          <w:sz w:val="24"/>
+          <w:szCs w:val="24"/>
+          <w:lang w:val="tr-TR"/>
+        </w:rPr>
+      </w:pPr>
+    </w:p>
+    <w:p>
+      <w:pPr>
+        <w:numPr>
+          <w:ilvl w:val="0"/>
+          <w:numId w:val="5"/>
+        </w:numPr>
+        <w:ind w:left="420" w:leftChars="0" w:hanging="420" w:firstLineChars="0"/>
+        <w:rPr>
+          <w:rFonts w:hint="default" w:ascii="Arial" w:hAnsi="Arial" w:cs="Arial"/>
+          <w:sz w:val="24"/>
+          <w:szCs w:val="24"/>
+          <w:lang w:val="tr-TR"/>
+        </w:rPr>
+      </w:pPr>
+      <w:r>
+        <w:rPr>
+          <w:rFonts w:hint="default" w:ascii="Arial" w:hAnsi="Arial" w:cs="Arial"/>
+          <w:sz w:val="24"/>
+          <w:szCs w:val="24"/>
+          <w:lang w:val="tr-TR"/>
+        </w:rPr>
+        <w:t>Testleri başarı ile tamamlanan M2GR sistemlerine manyetometre kalibrasyonu yapılmalıdır. Kalibrasyon sonrası Magn testleri uygulanır.</w:t>
+      </w:r>
+    </w:p>
+    <w:p>
+      <w:pPr>
+        <w:numPr>
+          <w:ilvl w:val="0"/>
+          <w:numId w:val="0"/>
+        </w:numPr>
+        <w:tabs>
+          <w:tab w:val="left" w:pos="420"/>
+        </w:tabs>
+        <w:rPr>
+          <w:rFonts w:hint="default" w:ascii="Arial" w:hAnsi="Arial" w:cs="Arial"/>
+          <w:sz w:val="24"/>
+          <w:szCs w:val="24"/>
+          <w:lang w:val="tr-TR"/>
+        </w:rPr>
+      </w:pPr>
+    </w:p>
+    <w:p>
+      <w:pPr>
+        <w:numPr>
+          <w:ilvl w:val="0"/>
+          <w:numId w:val="0"/>
+        </w:numPr>
+        <w:tabs>
+          <w:tab w:val="left" w:pos="420"/>
+        </w:tabs>
+        <w:rPr>
+          <w:rFonts w:hint="default" w:ascii="Arial" w:hAnsi="Arial" w:cs="Arial"/>
+          <w:b/>
+          <w:bCs/>
+          <w:sz w:val="24"/>
+          <w:szCs w:val="24"/>
+          <w:lang w:val="tr-TR"/>
+        </w:rPr>
+      </w:pPr>
+    </w:p>
+    <w:p>
+      <w:pPr>
+        <w:numPr>
+          <w:ilvl w:val="0"/>
+          <w:numId w:val="1"/>
+        </w:numPr>
+        <w:ind w:left="425" w:leftChars="0" w:hanging="425" w:firstLineChars="0"/>
+        <w:rPr>
+          <w:rFonts w:hint="default"/>
+          <w:b/>
+          <w:bCs/>
+          <w:sz w:val="24"/>
+          <w:szCs w:val="24"/>
+        </w:rPr>
+      </w:pPr>
+      <w:r>
+        <w:rPr>
+          <w:rFonts w:hint="default" w:ascii="Arial" w:hAnsi="Arial" w:cs="Arial"/>
+          <w:b/>
+          <w:bCs/>
+          <w:sz w:val="24"/>
+          <w:szCs w:val="24"/>
+          <w:lang w:val="tr-TR"/>
+        </w:rPr>
+        <w:t>Magn Testi</w:t>
+      </w:r>
+    </w:p>
+    <w:p>
+      <w:pPr>
+        <w:numPr>
+          <w:ilvl w:val="0"/>
+          <w:numId w:val="0"/>
+        </w:numPr>
+        <w:tabs>
+          <w:tab w:val="left" w:pos="420"/>
+        </w:tabs>
+        <w:rPr>
+          <w:rFonts w:hint="default" w:ascii="Arial" w:hAnsi="Arial" w:cs="Arial"/>
+          <w:b/>
+          <w:bCs/>
+          <w:sz w:val="24"/>
+          <w:szCs w:val="24"/>
+          <w:lang w:val="tr-TR"/>
+        </w:rPr>
+      </w:pPr>
+    </w:p>
+    <w:p>
+      <w:pPr>
+        <w:numPr>
+          <w:ilvl w:val="0"/>
+          <w:numId w:val="0"/>
+        </w:numPr>
+        <w:tabs>
+          <w:tab w:val="left" w:pos="420"/>
+        </w:tabs>
+        <w:jc w:val="center"/>
+        <w:rPr>
+          <w:b/>
+          <w:bCs/>
+          <w:sz w:val="24"/>
+          <w:szCs w:val="24"/>
+        </w:rPr>
+      </w:pPr>
+      <w:r>
+        <w:rPr>
+          <w:b/>
+          <w:bCs/>
+          <w:sz w:val="24"/>
+          <w:szCs w:val="24"/>
+        </w:rPr>
+        <w:drawing>
+          <wp:inline distT="0" distB="0" distL="114300" distR="114300">
+            <wp:extent cx="5271135" cy="260985"/>
+            <wp:effectExtent l="0" t="0" r="1905" b="13335"/>
+            <wp:docPr id="2" name="Picture 2"/>
+            <wp:cNvGraphicFramePr>
+              <a:graphicFrameLocks xmlns:a="http://schemas.openxmlformats.org/drawingml/2006/main" noChangeAspect="1"/>
+            </wp:cNvGraphicFramePr>
+            <a:graphic xmlns:a="http://schemas.openxmlformats.org/drawingml/2006/main">
+              <a:graphicData uri="http://schemas.openxmlformats.org/drawingml/2006/picture">
+                <pic:pic xmlns:pic="http://schemas.openxmlformats.org/drawingml/2006/picture">
+                  <pic:nvPicPr>
+                    <pic:cNvPr id="2" name="Picture 2"/>
+                    <pic:cNvPicPr>
+                      <a:picLocks noChangeAspect="1"/>
+                    </pic:cNvPicPr>
+                  </pic:nvPicPr>
+                  <pic:blipFill>
+                    <a:blip r:embed="rId13"/>
+                    <a:stretch>
+                      <a:fillRect/>
+                    </a:stretch>
+                  </pic:blipFill>
+                  <pic:spPr>
+                    <a:xfrm>
+                      <a:off x="0" y="0"/>
+                      <a:ext cx="5271135" cy="260985"/>
+                    </a:xfrm>
+                    <a:prstGeom prst="rect">
+                      <a:avLst/>
+                    </a:prstGeom>
+                    <a:noFill/>
+                    <a:ln>
+                      <a:noFill/>
+                    </a:ln>
+                  </pic:spPr>
+                </pic:pic>
+              </a:graphicData>
+            </a:graphic>
+          </wp:inline>
+        </w:drawing>
+      </w:r>
+    </w:p>
+    <w:p>
+      <w:pPr>
+        <w:pStyle w:val="6"/>
+        <w:numPr>
+          <w:ilvl w:val="0"/>
+          <w:numId w:val="0"/>
+        </w:numPr>
+        <w:tabs>
+          <w:tab w:val="left" w:pos="420"/>
+        </w:tabs>
+        <w:jc w:val="center"/>
+        <w:rPr>
+          <w:rFonts w:hint="default"/>
+          <w:b/>
+          <w:bCs/>
+          <w:sz w:val="24"/>
+          <w:szCs w:val="24"/>
+          <w:lang w:val="tr-TR"/>
+        </w:rPr>
+      </w:pPr>
+      <w:bookmarkStart w:id="4" w:name="_Ref19949"/>
+      <w:r>
+        <w:rPr>
+          <w:b/>
+          <w:bCs/>
+          <w:sz w:val="24"/>
+          <w:szCs w:val="24"/>
+          <w:lang w:val="tr-TR"/>
+        </w:rPr>
+        <w:t>Ş</w:t>
+      </w:r>
+      <w:r>
+        <w:rPr>
+          <w:rFonts w:hint="default"/>
+          <w:b/>
+          <w:bCs/>
+          <w:sz w:val="24"/>
+          <w:szCs w:val="24"/>
+          <w:lang w:val="tr-TR"/>
+        </w:rPr>
+        <w:t>ekil</w:t>
+      </w:r>
+      <w:r>
+        <w:rPr>
+          <w:b/>
+          <w:bCs/>
+          <w:sz w:val="24"/>
+          <w:szCs w:val="24"/>
+        </w:rPr>
+        <w:t xml:space="preserve"> </w:t>
+      </w:r>
+      <w:r>
+        <w:rPr>
+          <w:b/>
+          <w:bCs/>
+          <w:sz w:val="24"/>
+          <w:szCs w:val="24"/>
+        </w:rPr>
+        <w:fldChar w:fldCharType="begin"/>
+      </w:r>
+      <w:r>
+        <w:rPr>
+          <w:b/>
+          <w:bCs/>
+          <w:sz w:val="24"/>
+          <w:szCs w:val="24"/>
+        </w:rPr>
+        <w:instrText xml:space="preserve"> SEQ Figure \* ARABIC </w:instrText>
+      </w:r>
+      <w:r>
+        <w:rPr>
+          <w:b/>
+          <w:bCs/>
+          <w:sz w:val="24"/>
+          <w:szCs w:val="24"/>
+        </w:rPr>
+        <w:fldChar w:fldCharType="separate"/>
+      </w:r>
+      <w:r>
+        <w:rPr>
+          <w:b/>
+          <w:bCs/>
+          <w:sz w:val="24"/>
+          <w:szCs w:val="24"/>
+        </w:rPr>
+        <w:t>10</w:t>
+      </w:r>
+      <w:r>
+        <w:rPr>
+          <w:b/>
+          <w:bCs/>
+          <w:sz w:val="24"/>
+          <w:szCs w:val="24"/>
+        </w:rPr>
+        <w:fldChar w:fldCharType="end"/>
+      </w:r>
+      <w:r>
+        <w:rPr>
+          <w:rFonts w:hint="default"/>
+          <w:b/>
+          <w:bCs/>
+          <w:sz w:val="24"/>
+          <w:szCs w:val="24"/>
+          <w:lang w:val="tr-TR"/>
+        </w:rPr>
+        <w:t>: Magn Test Modu Seçimi</w:t>
+      </w:r>
+      <w:bookmarkEnd w:id="4"/>
+    </w:p>
+    <w:p>
+      <w:pPr>
+        <w:rPr>
+          <w:rFonts w:hint="default" w:ascii="Arial" w:hAnsi="Arial" w:cs="Arial"/>
+          <w:b w:val="0"/>
+          <w:bCs w:val="0"/>
+          <w:sz w:val="24"/>
+          <w:szCs w:val="24"/>
+          <w:lang w:val="tr-TR"/>
+        </w:rPr>
+      </w:pPr>
+    </w:p>
+    <w:p>
+      <w:pPr>
+        <w:numPr>
+          <w:ilvl w:val="0"/>
+          <w:numId w:val="5"/>
+        </w:numPr>
+        <w:ind w:left="420" w:leftChars="0" w:hanging="420" w:firstLineChars="0"/>
+        <w:rPr>
+          <w:rFonts w:hint="default" w:ascii="Arial" w:hAnsi="Arial" w:cs="Arial"/>
+          <w:sz w:val="24"/>
+          <w:szCs w:val="24"/>
+          <w:lang w:val="tr-TR"/>
+        </w:rPr>
+      </w:pPr>
+      <w:r>
+        <w:rPr>
+          <w:rFonts w:hint="default" w:ascii="Arial" w:hAnsi="Arial" w:cs="Arial"/>
+          <w:sz w:val="24"/>
+          <w:szCs w:val="24"/>
+          <w:lang w:val="tr-TR"/>
+        </w:rPr>
+        <w:t>M2GR sisteminden M2GR Kalibrasyon Sonrası ve Anten/RTK testleri başarı ile tamamlandıktan sonra Magn testleri yapılır.</w:t>
+      </w:r>
+    </w:p>
+    <w:p>
+      <w:pPr>
+        <w:rPr>
+          <w:rFonts w:hint="default" w:ascii="Arial" w:hAnsi="Arial" w:cs="Arial"/>
+          <w:sz w:val="24"/>
+          <w:szCs w:val="24"/>
+          <w:lang w:val="tr-TR"/>
+        </w:rPr>
+      </w:pPr>
+    </w:p>
+    <w:p>
+      <w:pPr>
+        <w:numPr>
+          <w:ilvl w:val="0"/>
+          <w:numId w:val="5"/>
+        </w:numPr>
+        <w:ind w:left="420" w:leftChars="0" w:hanging="420" w:firstLineChars="0"/>
+        <w:rPr>
+          <w:rFonts w:hint="default" w:ascii="Arial" w:hAnsi="Arial" w:cs="Arial"/>
+          <w:sz w:val="24"/>
+          <w:szCs w:val="24"/>
+          <w:lang w:val="tr-TR"/>
+        </w:rPr>
+      </w:pPr>
+      <w:r>
+        <w:rPr>
+          <w:rFonts w:hint="default" w:ascii="Arial" w:hAnsi="Arial" w:cs="Arial"/>
+          <w:sz w:val="24"/>
+          <w:szCs w:val="24"/>
+          <w:lang w:val="tr-TR"/>
+        </w:rPr>
+        <w:t>S3A sisteminden S3A Kalibrasyon Sonrası testlerini başarı ile tamamlandıktan sonra Magn testleri yapılır.</w:t>
+      </w:r>
+    </w:p>
+    <w:p>
+      <w:pPr>
+        <w:rPr>
+          <w:rFonts w:hint="default" w:ascii="Arial" w:hAnsi="Arial" w:cs="Arial"/>
+          <w:sz w:val="24"/>
+          <w:szCs w:val="24"/>
+          <w:lang w:val="tr-TR"/>
+        </w:rPr>
+      </w:pPr>
+    </w:p>
+    <w:p>
+      <w:pPr>
+        <w:numPr>
+          <w:ilvl w:val="0"/>
+          <w:numId w:val="5"/>
+        </w:numPr>
+        <w:ind w:left="420" w:leftChars="0" w:hanging="420" w:firstLineChars="0"/>
+        <w:rPr>
+          <w:rFonts w:hint="default" w:ascii="Arial" w:hAnsi="Arial" w:cs="Arial"/>
+          <w:sz w:val="24"/>
+          <w:szCs w:val="24"/>
+          <w:lang w:val="tr-TR"/>
+        </w:rPr>
+      </w:pPr>
+      <w:r>
+        <w:rPr>
+          <w:rFonts w:hint="default" w:ascii="Arial" w:hAnsi="Arial" w:cs="Arial"/>
+          <w:sz w:val="24"/>
+          <w:szCs w:val="24"/>
+          <w:lang w:val="tr-TR"/>
+        </w:rPr>
+        <w:fldChar w:fldCharType="begin"/>
+      </w:r>
+      <w:r>
+        <w:rPr>
+          <w:rFonts w:hint="default" w:ascii="Arial" w:hAnsi="Arial" w:cs="Arial"/>
+          <w:sz w:val="24"/>
+          <w:szCs w:val="24"/>
+          <w:lang w:val="tr-TR"/>
+        </w:rPr>
+        <w:instrText xml:space="preserve"> REF _Ref19949 \h </w:instrText>
+      </w:r>
+      <w:r>
+        <w:rPr>
+          <w:rFonts w:hint="default" w:ascii="Arial" w:hAnsi="Arial" w:cs="Arial"/>
+          <w:sz w:val="24"/>
+          <w:szCs w:val="24"/>
+          <w:lang w:val="tr-TR"/>
+        </w:rPr>
+        <w:fldChar w:fldCharType="separate"/>
+      </w:r>
+      <w:r>
+        <w:rPr>
+          <w:rFonts w:hint="default" w:ascii="Arial" w:hAnsi="Arial" w:cs="Arial"/>
+          <w:b/>
+          <w:bCs/>
+          <w:sz w:val="24"/>
+          <w:szCs w:val="24"/>
+          <w:lang w:val="tr-TR"/>
+        </w:rPr>
+        <w:t>Şekil</w:t>
+      </w:r>
+      <w:r>
+        <w:rPr>
+          <w:rFonts w:hint="default" w:ascii="Arial" w:hAnsi="Arial" w:cs="Arial"/>
+          <w:b/>
+          <w:bCs/>
+          <w:sz w:val="24"/>
+          <w:szCs w:val="24"/>
+        </w:rPr>
+        <w:t xml:space="preserve"> 10</w:t>
+      </w:r>
+      <w:r>
+        <w:rPr>
+          <w:rFonts w:hint="default" w:ascii="Arial" w:hAnsi="Arial" w:cs="Arial"/>
+          <w:sz w:val="24"/>
+          <w:szCs w:val="24"/>
+          <w:lang w:val="tr-TR"/>
+        </w:rPr>
+        <w:fldChar w:fldCharType="end"/>
+      </w:r>
+      <w:r>
+        <w:rPr>
+          <w:rFonts w:hint="default" w:ascii="Arial" w:hAnsi="Arial" w:cs="Arial"/>
+          <w:sz w:val="24"/>
+          <w:szCs w:val="24"/>
+          <w:lang w:val="tr-TR"/>
+        </w:rPr>
+        <w:t xml:space="preserve"> ile gösterilen mod tuşuna basılır. Cihaza ait PN ve SN girilir. </w:t>
+      </w:r>
+    </w:p>
+    <w:p>
+      <w:pPr>
+        <w:rPr>
+          <w:rFonts w:hint="default" w:ascii="Arial" w:hAnsi="Arial" w:cs="Arial"/>
+          <w:b/>
+          <w:bCs/>
+          <w:sz w:val="24"/>
+          <w:szCs w:val="24"/>
+          <w:lang w:val="tr-TR"/>
+        </w:rPr>
+      </w:pPr>
+    </w:p>
+    <w:p>
+      <w:pPr>
+        <w:numPr>
+          <w:ilvl w:val="0"/>
+          <w:numId w:val="5"/>
+        </w:numPr>
+        <w:ind w:left="420" w:leftChars="0" w:hanging="420" w:firstLineChars="0"/>
+        <w:rPr>
+          <w:rFonts w:hint="default" w:ascii="Arial" w:hAnsi="Arial" w:cs="Arial"/>
+          <w:b w:val="0"/>
+          <w:bCs w:val="0"/>
+          <w:sz w:val="24"/>
+          <w:szCs w:val="24"/>
+          <w:lang w:val="tr-TR"/>
+        </w:rPr>
+      </w:pPr>
+      <w:r>
+        <w:rPr>
+          <w:rFonts w:hint="default" w:ascii="Arial" w:hAnsi="Arial" w:cs="Arial"/>
+          <w:b/>
+          <w:bCs/>
+          <w:sz w:val="24"/>
+          <w:szCs w:val="24"/>
+          <w:lang w:val="tr-TR"/>
+        </w:rPr>
+        <w:t>Başlat</w:t>
+      </w:r>
+      <w:r>
+        <w:rPr>
+          <w:rFonts w:hint="default" w:ascii="Arial" w:hAnsi="Arial" w:cs="Arial"/>
+          <w:b w:val="0"/>
+          <w:bCs w:val="0"/>
+          <w:sz w:val="24"/>
+          <w:szCs w:val="24"/>
+          <w:lang w:val="tr-TR"/>
+        </w:rPr>
+        <w:t xml:space="preserve"> butonu ile test başlatılır.</w:t>
+      </w:r>
+    </w:p>
+    <w:p>
+      <w:pPr>
+        <w:rPr>
+          <w:rFonts w:hint="default" w:ascii="Arial" w:hAnsi="Arial" w:cs="Arial"/>
+          <w:b w:val="0"/>
+          <w:bCs w:val="0"/>
+          <w:sz w:val="24"/>
+          <w:szCs w:val="24"/>
+          <w:lang w:val="tr-TR"/>
+        </w:rPr>
+      </w:pPr>
+    </w:p>
+    <w:p>
+      <w:pPr>
+        <w:numPr>
+          <w:ilvl w:val="0"/>
+          <w:numId w:val="5"/>
+        </w:numPr>
+        <w:ind w:left="420" w:leftChars="0" w:hanging="420" w:firstLineChars="0"/>
+        <w:rPr>
+          <w:rFonts w:hint="default" w:ascii="Arial" w:hAnsi="Arial" w:cs="Arial"/>
+          <w:b w:val="0"/>
+          <w:bCs w:val="0"/>
+          <w:sz w:val="24"/>
+          <w:szCs w:val="24"/>
+          <w:lang w:val="tr-TR"/>
+        </w:rPr>
+      </w:pPr>
+      <w:r>
+        <w:rPr>
+          <w:rFonts w:hint="default" w:ascii="Arial" w:hAnsi="Arial" w:cs="Arial"/>
+          <w:b w:val="0"/>
+          <w:bCs w:val="0"/>
+          <w:sz w:val="24"/>
+          <w:szCs w:val="24"/>
+          <w:lang w:val="tr-TR"/>
+        </w:rPr>
+        <w:t>Test tamamlandıktan sonra “Magn Testi Sonuçları” klasöründe “MagnTestiSonucları.xlsx” dosyası ile sonuçlar gözlemlenir.</w:t>
+      </w:r>
+    </w:p>
+    <w:p>
+      <w:pPr>
+        <w:numPr>
+          <w:ilvl w:val="0"/>
+          <w:numId w:val="0"/>
+        </w:numPr>
+        <w:tabs>
+          <w:tab w:val="left" w:pos="420"/>
+        </w:tabs>
+        <w:rPr>
+          <w:rFonts w:hint="default" w:ascii="Arial" w:hAnsi="Arial" w:cs="Arial"/>
+          <w:b w:val="0"/>
+          <w:bCs w:val="0"/>
+          <w:sz w:val="24"/>
+          <w:szCs w:val="24"/>
+          <w:lang w:val="tr-TR"/>
+        </w:rPr>
+      </w:pPr>
+    </w:p>
+    <w:p>
+      <w:pPr>
+        <w:numPr>
+          <w:ilvl w:val="0"/>
+          <w:numId w:val="5"/>
+        </w:numPr>
+        <w:ind w:left="420" w:leftChars="0" w:hanging="420" w:firstLineChars="0"/>
+        <w:rPr>
+          <w:rFonts w:hint="default" w:ascii="Arial" w:hAnsi="Arial" w:cs="Arial"/>
+          <w:b w:val="0"/>
+          <w:bCs w:val="0"/>
+          <w:sz w:val="24"/>
+          <w:szCs w:val="24"/>
+          <w:lang w:val="tr-TR"/>
+        </w:rPr>
+      </w:pPr>
+      <w:r>
+        <w:rPr>
+          <w:rFonts w:hint="default" w:ascii="Arial" w:hAnsi="Arial" w:cs="Arial"/>
+          <w:b w:val="0"/>
+          <w:bCs w:val="0"/>
+          <w:sz w:val="24"/>
+          <w:szCs w:val="24"/>
+          <w:lang w:val="tr-TR"/>
+        </w:rPr>
+        <w:t>Magn testlerini başarı ile ta</w:t>
+      </w:r>
+      <w:bookmarkStart w:id="5" w:name="_GoBack"/>
+      <w:bookmarkEnd w:id="5"/>
+      <w:r>
+        <w:rPr>
+          <w:rFonts w:hint="default" w:ascii="Arial" w:hAnsi="Arial" w:cs="Arial"/>
+          <w:b w:val="0"/>
+          <w:bCs w:val="0"/>
+          <w:sz w:val="24"/>
+          <w:szCs w:val="24"/>
+          <w:lang w:val="tr-TR"/>
+        </w:rPr>
+        <w:t>mamlamış sistemlere uygun config dosyaları atılır. Kalibrasyon matrislerini ve diğer settings ayarlarını depolamak için Factory mode ile config ayarları “Config” klasörüne sisteme ait seri numarası ile kaydedilir.</w:t>
+      </w:r>
+    </w:p>
+    <w:p>
+      <w:pPr>
+        <w:rPr>
+          <w:rFonts w:hint="default" w:ascii="Arial" w:hAnsi="Arial" w:cs="Arial"/>
+          <w:b w:val="0"/>
+          <w:bCs w:val="0"/>
+          <w:sz w:val="24"/>
+          <w:szCs w:val="24"/>
+          <w:lang w:val="tr-TR"/>
         </w:rPr>
       </w:pPr>
     </w:p>
@@ -2793,6 +3933,26 @@
     </w:lvl>
   </w:abstractNum>
   <w:abstractNum w:abstractNumId="1">
+    <w:nsid w:val="FB074CB6"/>
+    <w:multiLevelType w:val="singleLevel"/>
+    <w:tmpl w:val="FB074CB6"/>
+    <w:lvl w:ilvl="0" w:tentative="0">
+      <w:start w:val="1"/>
+      <w:numFmt w:val="decimal"/>
+      <w:lvlText w:val="%1."/>
+      <w:lvlJc w:val="left"/>
+      <w:pPr>
+        <w:tabs>
+          <w:tab w:val="left" w:pos="425"/>
+        </w:tabs>
+        <w:ind w:left="425" w:leftChars="0" w:hanging="425" w:firstLineChars="0"/>
+      </w:pPr>
+      <w:rPr>
+        <w:rFonts w:hint="default"/>
+      </w:rPr>
+    </w:lvl>
+  </w:abstractNum>
+  <w:abstractNum w:abstractNumId="2">
     <w:nsid w:val="1DA19E67"/>
     <w:multiLevelType w:val="multilevel"/>
     <w:tmpl w:val="1DA19E67"/>
@@ -2941,7 +4101,7 @@
       </w:rPr>
     </w:lvl>
   </w:abstractNum>
-  <w:abstractNum w:abstractNumId="2">
+  <w:abstractNum w:abstractNumId="3">
     <w:nsid w:val="1FCF58C4"/>
     <w:multiLevelType w:val="singleLevel"/>
     <w:tmpl w:val="1FCF58C4"/>
@@ -2961,7 +4121,7 @@
       </w:rPr>
     </w:lvl>
   </w:abstractNum>
-  <w:abstractNum w:abstractNumId="3">
+  <w:abstractNum w:abstractNumId="4">
     <w:nsid w:val="748D2358"/>
     <w:multiLevelType w:val="multilevel"/>
     <w:tmpl w:val="748D2358"/>
@@ -3111,16 +4271,19 @@
     </w:lvl>
   </w:abstractNum>
   <w:num w:numId="1">
+    <w:abstractNumId w:val="1"/>
+  </w:num>
+  <w:num w:numId="2">
     <w:abstractNumId w:val="0"/>
   </w:num>
-  <w:num w:numId="2">
-    <w:abstractNumId w:val="3"/>
-  </w:num>
   <w:num w:numId="3">
-    <w:abstractNumId w:val="1"/>
+    <w:abstractNumId w:val="4"/>
   </w:num>
   <w:num w:numId="4">
     <w:abstractNumId w:val="2"/>
+  </w:num>
+  <w:num w:numId="5">
+    <w:abstractNumId w:val="3"/>
   </w:num>
 </w:numbering>
 </file>

</xml_diff>